<commit_message>
docs: remover referencia ao repositorio no documento NoSQL
</commit_message>
<xml_diff>
--- a/docs/EcoTracker_NoSQL_MongoDB.docx
+++ b/docs/EcoTracker_NoSQL_MongoDB.docx
@@ -185,7 +185,7 @@
           <w:i w:val="0"/>
           <w:sz w:val="20"/>
         </w:rPr>
-        <w:t>Repositório: https://github.com/mde-figu/aspcore8 (pasta mongodb/)</w:t>
+        <w:t>MongoDB Community 8.0 – scripts em mongosh (anexos)</w:t>
       </w:r>
     </w:p>
     <w:p>
@@ -10295,7 +10295,7 @@
           <w:rFonts w:ascii="Calibri" w:hAnsi="Calibri"/>
           <w:sz w:val="22"/>
         </w:rPr>
-        <w:t>•  Todos os arquivos estão no repositório do projeto: https://github.com/mde-figu/aspcore8</w:t>
+        <w:t>•  Os arquivos .js e .json acompanham esta entrega como anexos.</w:t>
       </w:r>
     </w:p>
     <w:sectPr>

</xml_diff>